<commit_message>
Rebuild V13 script to 77 beats — canonical viral structure
Replaced 104-beat draft with 77-beat version following Creator Brief v3.0 structure exactly: Hook(10) + T1 Anticipation Burn(9) + T2 Balance Blindspot(8) + CTA@36%(2) + T3 Expertise Trap(8) + T4 Night Drain(8) + T5 Upgrade Lock(9) + System Close(4) + Villain Last Trick(11) + Identity Close(8). 780 words ~6 min. Add image prompts PDF, thumbnail prompts and prepublish checklist.

Co-Authored-By: Claude Sonnet 4.6 <noreply@anthropic.com>
Claude-Session: https://claude.ai/code/session_01L4D3BJE5wxKGrRneu3Lana
</commit_message>
<xml_diff>
--- a/V13_final_SCRIPT.docx
+++ b/V13_final_SCRIPT.docx
@@ -35,7 +35,7 @@
         <w:rPr>
           <w:b/>
           <w:i/>
-          <w:sz w:val="30"/>
+          <w:sz w:val="28"/>
         </w:rPr>
         <w:t>5 Ways Your Brain Physically Rewires Itself to Stay Broke (Without Telling You)</w:t>
       </w:r>
@@ -108,7 +108,7 @@
         <w:rPr>
           <w:sz w:val="22"/>
         </w:rPr>
-        <w:t>Not because of bad investments.</w:t>
+        <w:t>Not because of bad decisions.</w:t>
       </w:r>
     </w:p>
     <w:p>
@@ -127,7 +127,7 @@
         <w:rPr>
           <w:sz w:val="22"/>
         </w:rPr>
-        <w:t>Not because of unexpected expenses.</w:t>
+        <w:t>Not because of poor discipline.</w:t>
       </w:r>
     </w:p>
     <w:p>
@@ -165,7 +165,7 @@
         <w:rPr>
           <w:sz w:val="22"/>
         </w:rPr>
-        <w:t>Programs that physically alter neural architecture — every month.</w:t>
+        <w:t>We're going to show you all five — in the order they fire.</w:t>
       </w:r>
     </w:p>
     <w:p>
@@ -203,7 +203,7 @@
         <w:rPr>
           <w:sz w:val="22"/>
         </w:rPr>
-        <w:t>We're going to show you all five.</w:t>
+        <w:t>The fifth one compounds biologically — not just financially.</w:t>
       </w:r>
     </w:p>
     <w:p>
@@ -222,7 +222,7 @@
         <w:rPr>
           <w:sz w:val="22"/>
         </w:rPr>
-        <w:t>The order matters. Trap One fires first — and makes everything else possible.</w:t>
+        <w:t>His brain started running Trap One this week.</w:t>
       </w:r>
     </w:p>
     <w:p>
@@ -241,7 +241,7 @@
         <w:rPr>
           <w:sz w:val="22"/>
         </w:rPr>
-        <w:t>Your brain started running it this week.</w:t>
+        <w:t>So did yours.</w:t>
       </w:r>
     </w:p>
     <w:p/>
@@ -274,7 +274,7 @@
         <w:rPr>
           <w:sz w:val="22"/>
         </w:rPr>
-        <w:t>It is Wednesday afternoon.</w:t>
+        <w:t>It is Wednesday. Alex hasn't been paid.</w:t>
       </w:r>
     </w:p>
     <w:p>
@@ -293,7 +293,7 @@
         <w:rPr>
           <w:sz w:val="22"/>
         </w:rPr>
-        <w:t>Alex hasn't been paid yet. He already knows what he's going to buy.</w:t>
+        <w:t>He already knows what he's going to buy.</w:t>
       </w:r>
     </w:p>
     <w:p>
@@ -312,7 +312,7 @@
         <w:rPr>
           <w:sz w:val="22"/>
         </w:rPr>
-        <w:t>The jacket. The dinner. The upgrade he's been putting off.</w:t>
+        <w:t>Wolfram Schultz — Cambridge — won part of the Nobel Prize for this.</w:t>
       </w:r>
     </w:p>
     <w:p>
@@ -331,7 +331,7 @@
         <w:rPr>
           <w:sz w:val="22"/>
         </w:rPr>
-        <w:t>He hasn't made these decisions. His brain made them 48 hours ago.</w:t>
+        <w:t>Dopamine does not fire when the reward arrives.</w:t>
       </w:r>
     </w:p>
     <w:p>
@@ -350,7 +350,7 @@
         <w:rPr>
           <w:sz w:val="22"/>
         </w:rPr>
-        <w:t>Wolfram Schultz — neuroscientist at Cambridge University —</w:t>
+        <w:t>It fires when the brain predicts the reward is coming.</w:t>
       </w:r>
     </w:p>
     <w:p>
@@ -369,7 +369,7 @@
         <w:rPr>
           <w:sz w:val="22"/>
         </w:rPr>
-        <w:t>won part of the Nobel Prize for discovering this.</w:t>
+        <w:t>By Wednesday, the dopamine peak has already passed.</w:t>
       </w:r>
     </w:p>
     <w:p>
@@ -388,7 +388,7 @@
         <w:rPr>
           <w:sz w:val="22"/>
         </w:rPr>
-        <w:t>Dopamine does not fire when the reward arrives.</w:t>
+        <w:t>By Friday — payday — the signal is declining.</w:t>
       </w:r>
     </w:p>
     <w:p>
@@ -407,7 +407,7 @@
         <w:rPr>
           <w:sz w:val="22"/>
         </w:rPr>
-        <w:t>It fires when the brain predicts the reward is coming.</w:t>
+        <w:t>His spending on Friday is not a decision. It is a receipt.</w:t>
       </w:r>
     </w:p>
     <w:p>
@@ -421,120 +421,6 @@
           <w:sz w:val="18"/>
         </w:rPr>
         <w:t xml:space="preserve">[19]  </w:t>
-      </w:r>
-      <w:r>
-        <w:rPr>
-          <w:sz w:val="22"/>
-        </w:rPr>
-        <w:t>By Wednesday, Alex's dopamine peak has already passed.</w:t>
-      </w:r>
-    </w:p>
-    <w:p>
-      <w:pPr>
-        <w:spacing w:before="20" w:after="20"/>
-      </w:pPr>
-      <w:r>
-        <w:rPr>
-          <w:b/>
-          <w:color w:val="888888"/>
-          <w:sz w:val="18"/>
-        </w:rPr>
-        <w:t xml:space="preserve">[20]  </w:t>
-      </w:r>
-      <w:r>
-        <w:rPr>
-          <w:sz w:val="22"/>
-        </w:rPr>
-        <w:t>By Friday — payday — the signal is declining.</w:t>
-      </w:r>
-    </w:p>
-    <w:p>
-      <w:pPr>
-        <w:spacing w:before="20" w:after="20"/>
-      </w:pPr>
-      <w:r>
-        <w:rPr>
-          <w:b/>
-          <w:color w:val="888888"/>
-          <w:sz w:val="18"/>
-        </w:rPr>
-        <w:t xml:space="preserve">[21]  </w:t>
-      </w:r>
-      <w:r>
-        <w:rPr>
-          <w:sz w:val="22"/>
-        </w:rPr>
-        <w:t>His spending on Friday is not a decision. It is a receipt.</w:t>
-      </w:r>
-    </w:p>
-    <w:p>
-      <w:pPr>
-        <w:spacing w:before="20" w:after="20"/>
-      </w:pPr>
-      <w:r>
-        <w:rPr>
-          <w:b/>
-          <w:color w:val="888888"/>
-          <w:sz w:val="18"/>
-        </w:rPr>
-        <w:t xml:space="preserve">[22]  </w:t>
-      </w:r>
-      <w:r>
-        <w:rPr>
-          <w:sz w:val="22"/>
-        </w:rPr>
-        <w:t>The brain spent the money before the salary existed.</w:t>
-      </w:r>
-    </w:p>
-    <w:p>
-      <w:pPr>
-        <w:spacing w:before="20" w:after="20"/>
-      </w:pPr>
-      <w:r>
-        <w:rPr>
-          <w:b/>
-          <w:color w:val="888888"/>
-          <w:sz w:val="18"/>
-        </w:rPr>
-        <w:t xml:space="preserve">[23]  </w:t>
-      </w:r>
-      <w:r>
-        <w:rPr>
-          <w:sz w:val="22"/>
-        </w:rPr>
-        <w:t>This is not a character flaw. It is a mechanism.</w:t>
-      </w:r>
-    </w:p>
-    <w:p>
-      <w:pPr>
-        <w:spacing w:before="20" w:after="20"/>
-      </w:pPr>
-      <w:r>
-        <w:rPr>
-          <w:b/>
-          <w:color w:val="888888"/>
-          <w:sz w:val="18"/>
-        </w:rPr>
-        <w:t xml:space="preserve">[24]  </w:t>
-      </w:r>
-      <w:r>
-        <w:rPr>
-          <w:sz w:val="22"/>
-        </w:rPr>
-        <w:t>It runs in every brain — including the ones that know it runs.</w:t>
-      </w:r>
-    </w:p>
-    <w:p>
-      <w:pPr>
-        <w:spacing w:before="20" w:after="20"/>
-      </w:pPr>
-      <w:r>
-        <w:rPr>
-          <w:b/>
-          <w:color w:val="888888"/>
-          <w:sz w:val="18"/>
-        </w:rPr>
-        <w:t xml:space="preserve">[25]  </w:t>
       </w:r>
       <w:r>
         <w:rPr>
@@ -567,7 +453,7 @@
           <w:color w:val="888888"/>
           <w:sz w:val="18"/>
         </w:rPr>
-        <w:t xml:space="preserve">[26]  </w:t>
+        <w:t xml:space="preserve">[20]  </w:t>
       </w:r>
       <w:r>
         <w:rPr>
@@ -586,7 +472,7 @@
           <w:color w:val="888888"/>
           <w:sz w:val="18"/>
         </w:rPr>
-        <w:t xml:space="preserve">[27]  </w:t>
+        <w:t xml:space="preserve">[21]  </w:t>
       </w:r>
       <w:r>
         <w:rPr>
@@ -605,13 +491,13 @@
           <w:color w:val="888888"/>
           <w:sz w:val="18"/>
         </w:rPr>
-        <w:t xml:space="preserve">[28]  </w:t>
+        <w:t xml:space="preserve">[22]  </w:t>
       </w:r>
       <w:r>
         <w:rPr>
           <w:sz w:val="22"/>
         </w:rPr>
-        <w:t>In the last thirty days, Alex checked his balance six times.</w:t>
+        <w:t>In thirty days: six balance checks. All six after a paycheck. Zero after a large purchase.</w:t>
       </w:r>
     </w:p>
     <w:p>
@@ -624,13 +510,13 @@
           <w:color w:val="888888"/>
           <w:sz w:val="18"/>
         </w:rPr>
-        <w:t xml:space="preserve">[29]  </w:t>
+        <w:t xml:space="preserve">[23]  </w:t>
       </w:r>
       <w:r>
         <w:rPr>
           <w:sz w:val="22"/>
         </w:rPr>
-        <w:t>All six were after a paycheck arrived. Zero after a large purchase.</w:t>
+        <w:t>Galai and Sade — Hebrew University, 2006 — called it the ostrich effect.</w:t>
       </w:r>
     </w:p>
     <w:p>
@@ -643,45 +529,7 @@
           <w:color w:val="888888"/>
           <w:sz w:val="18"/>
         </w:rPr>
-        <w:t xml:space="preserve">[30]  </w:t>
-      </w:r>
-      <w:r>
-        <w:rPr>
-          <w:sz w:val="22"/>
-        </w:rPr>
-        <w:t>Dan Galai and Orly Sade — Hebrew University — documented this pattern in 2006.</w:t>
-      </w:r>
-    </w:p>
-    <w:p>
-      <w:pPr>
-        <w:spacing w:before="20" w:after="20"/>
-      </w:pPr>
-      <w:r>
-        <w:rPr>
-          <w:b/>
-          <w:color w:val="888888"/>
-          <w:sz w:val="18"/>
-        </w:rPr>
-        <w:t xml:space="preserve">[31]  </w:t>
-      </w:r>
-      <w:r>
-        <w:rPr>
-          <w:sz w:val="22"/>
-        </w:rPr>
-        <w:t>They called it the ostrich effect.</w:t>
-      </w:r>
-    </w:p>
-    <w:p>
-      <w:pPr>
-        <w:spacing w:before="20" w:after="20"/>
-      </w:pPr>
-      <w:r>
-        <w:rPr>
-          <w:b/>
-          <w:color w:val="888888"/>
-          <w:sz w:val="18"/>
-        </w:rPr>
-        <w:t xml:space="preserve">[32]  </w:t>
+        <w:t xml:space="preserve">[24]  </w:t>
       </w:r>
       <w:r>
         <w:rPr>
@@ -700,7 +548,7 @@
           <w:color w:val="888888"/>
           <w:sz w:val="18"/>
         </w:rPr>
-        <w:t xml:space="preserve">[33]  </w:t>
+        <w:t xml:space="preserve">[25]  </w:t>
       </w:r>
       <w:r>
         <w:rPr>
@@ -719,7 +567,7 @@
           <w:color w:val="888888"/>
           <w:sz w:val="18"/>
         </w:rPr>
-        <w:t xml:space="preserve">[34]  </w:t>
+        <w:t xml:space="preserve">[26]  </w:t>
       </w:r>
       <w:r>
         <w:rPr>
@@ -738,51 +586,13 @@
           <w:color w:val="888888"/>
           <w:sz w:val="18"/>
         </w:rPr>
-        <w:t xml:space="preserve">[35]  </w:t>
+        <w:t xml:space="preserve">[27]  </w:t>
       </w:r>
       <w:r>
         <w:rPr>
           <w:sz w:val="22"/>
         </w:rPr>
         <w:t>After enough repetitions, avoidance became automatic.</w:t>
-      </w:r>
-    </w:p>
-    <w:p>
-      <w:pPr>
-        <w:spacing w:before="20" w:after="20"/>
-      </w:pPr>
-      <w:r>
-        <w:rPr>
-          <w:b/>
-          <w:color w:val="888888"/>
-          <w:sz w:val="18"/>
-        </w:rPr>
-        <w:t xml:space="preserve">[36]  </w:t>
-      </w:r>
-      <w:r>
-        <w:rPr>
-          <w:sz w:val="22"/>
-        </w:rPr>
-        <w:t>The money leaves. Alex doesn't see it leave.</w:t>
-      </w:r>
-    </w:p>
-    <w:p>
-      <w:pPr>
-        <w:spacing w:before="20" w:after="20"/>
-      </w:pPr>
-      <w:r>
-        <w:rPr>
-          <w:b/>
-          <w:color w:val="888888"/>
-          <w:sz w:val="18"/>
-        </w:rPr>
-        <w:t xml:space="preserve">[37]  </w:t>
-      </w:r>
-      <w:r>
-        <w:rPr>
-          <w:sz w:val="22"/>
-        </w:rPr>
-        <w:t>Trap One runs undisturbed. And Trap Three gives it vocabulary.</w:t>
       </w:r>
     </w:p>
     <w:p/>
@@ -809,13 +619,13 @@
           <w:color w:val="888888"/>
           <w:sz w:val="18"/>
         </w:rPr>
-        <w:t xml:space="preserve">[38]  </w:t>
+        <w:t xml:space="preserve">[28]  </w:t>
       </w:r>
       <w:r>
         <w:rPr>
           <w:sz w:val="22"/>
         </w:rPr>
-        <w:t>If your brain is running these programs right now — subscribe.</w:t>
+        <w:t>If your brain is doing this to you right now — subscribe.</w:t>
       </w:r>
     </w:p>
     <w:p>
@@ -828,13 +638,13 @@
           <w:color w:val="888888"/>
           <w:sz w:val="18"/>
         </w:rPr>
-        <w:t xml:space="preserve">[39]  </w:t>
+        <w:t xml:space="preserve">[29]  </w:t>
       </w:r>
       <w:r>
         <w:rPr>
           <w:sz w:val="22"/>
         </w:rPr>
-        <w:t>One bias. Every week. It's free. And it might save you more than you think.</w:t>
+        <w:t>We break down a new bias every week. It's free. And it might save you more than you think.</w:t>
       </w:r>
     </w:p>
     <w:p/>
@@ -861,13 +671,13 @@
           <w:color w:val="888888"/>
           <w:sz w:val="18"/>
         </w:rPr>
-        <w:t xml:space="preserve">[40]  </w:t>
+        <w:t xml:space="preserve">[30]  </w:t>
       </w:r>
       <w:r>
         <w:rPr>
           <w:sz w:val="22"/>
         </w:rPr>
-        <w:t>Alex started reading about personal finance eight months ago.</w:t>
+        <w:t>Alex has been reading about behavioral finance for eight months.</w:t>
       </w:r>
     </w:p>
     <w:p>
@@ -880,7 +690,7 @@
           <w:color w:val="888888"/>
           <w:sz w:val="18"/>
         </w:rPr>
-        <w:t xml:space="preserve">[41]  </w:t>
+        <w:t xml:space="preserve">[31]  </w:t>
       </w:r>
       <w:r>
         <w:rPr>
@@ -899,13 +709,13 @@
           <w:color w:val="888888"/>
           <w:sz w:val="18"/>
         </w:rPr>
-        <w:t xml:space="preserve">[42]  </w:t>
+        <w:t xml:space="preserve">[32]  </w:t>
       </w:r>
       <w:r>
         <w:rPr>
           <w:sz w:val="22"/>
         </w:rPr>
-        <w:t>Terrance Odean — behavioral economist at UC Berkeley — studied this for a decade.</w:t>
+        <w:t>Terrance Odean — UC Berkeley — studied investors for a decade.</w:t>
       </w:r>
     </w:p>
     <w:p>
@@ -918,13 +728,13 @@
           <w:color w:val="888888"/>
           <w:sz w:val="18"/>
         </w:rPr>
-        <w:t xml:space="preserve">[43]  </w:t>
+        <w:t xml:space="preserve">[33]  </w:t>
       </w:r>
       <w:r>
         <w:rPr>
           <w:sz w:val="22"/>
         </w:rPr>
-        <w:t>His finding: investors who traded more frequently earned lower returns.</w:t>
+        <w:t>The ones who traded most frequently earned the lowest returns.</w:t>
       </w:r>
     </w:p>
     <w:p>
@@ -937,7 +747,7 @@
           <w:color w:val="888888"/>
           <w:sz w:val="18"/>
         </w:rPr>
-        <w:t xml:space="preserve">[44]  </w:t>
+        <w:t xml:space="preserve">[34]  </w:t>
       </w:r>
       <w:r>
         <w:rPr>
@@ -956,13 +766,13 @@
           <w:color w:val="888888"/>
           <w:sz w:val="18"/>
         </w:rPr>
-        <w:t xml:space="preserve">[45]  </w:t>
+        <w:t xml:space="preserve">[35]  </w:t>
       </w:r>
       <w:r>
         <w:rPr>
           <w:sz w:val="22"/>
         </w:rPr>
-        <w:t>Daniel Kahneman documented the same pattern:</w:t>
+        <w:t>Daniel Kahneman: eighty percent of investors believe they are above average.</w:t>
       </w:r>
     </w:p>
     <w:p>
@@ -975,13 +785,13 @@
           <w:color w:val="888888"/>
           <w:sz w:val="18"/>
         </w:rPr>
-        <w:t xml:space="preserve">[46]  </w:t>
+        <w:t xml:space="preserve">[36]  </w:t>
       </w:r>
       <w:r>
         <w:rPr>
           <w:sz w:val="22"/>
         </w:rPr>
-        <w:t>eighty percent of investors believe they are above-average investors.</w:t>
+        <w:t>Fifty percent are, by definition, wrong.</w:t>
       </w:r>
     </w:p>
     <w:p>
@@ -994,108 +804,13 @@
           <w:color w:val="888888"/>
           <w:sz w:val="18"/>
         </w:rPr>
-        <w:t xml:space="preserve">[47]  </w:t>
+        <w:t xml:space="preserve">[37]  </w:t>
       </w:r>
       <w:r>
         <w:rPr>
           <w:sz w:val="22"/>
         </w:rPr>
-        <w:t>Fifty percent of them are, by definition, wrong.</w:t>
-      </w:r>
-    </w:p>
-    <w:p>
-      <w:pPr>
-        <w:spacing w:before="20" w:after="20"/>
-      </w:pPr>
-      <w:r>
-        <w:rPr>
-          <w:b/>
-          <w:color w:val="888888"/>
-          <w:sz w:val="18"/>
-        </w:rPr>
-        <w:t xml:space="preserve">[48]  </w:t>
-      </w:r>
-      <w:r>
-        <w:rPr>
-          <w:sz w:val="22"/>
-        </w:rPr>
-        <w:t>The expertise trap rewires the brain in a precise direction:</w:t>
-      </w:r>
-    </w:p>
-    <w:p>
-      <w:pPr>
-        <w:spacing w:before="20" w:after="20"/>
-      </w:pPr>
-      <w:r>
-        <w:rPr>
-          <w:b/>
-          <w:color w:val="888888"/>
-          <w:sz w:val="18"/>
-        </w:rPr>
-        <w:t xml:space="preserve">[49]  </w:t>
-      </w:r>
-      <w:r>
-        <w:rPr>
-          <w:sz w:val="22"/>
-        </w:rPr>
-        <w:t>more vocabulary produces more certainty — not more accuracy.</w:t>
-      </w:r>
-    </w:p>
-    <w:p>
-      <w:pPr>
-        <w:spacing w:before="20" w:after="20"/>
-      </w:pPr>
-      <w:r>
-        <w:rPr>
-          <w:b/>
-          <w:color w:val="888888"/>
-          <w:sz w:val="18"/>
-        </w:rPr>
-        <w:t xml:space="preserve">[50]  </w:t>
-      </w:r>
-      <w:r>
-        <w:rPr>
-          <w:sz w:val="22"/>
-        </w:rPr>
-        <w:t>Alex doesn't know less than he did eight months ago.</w:t>
-      </w:r>
-    </w:p>
-    <w:p>
-      <w:pPr>
-        <w:spacing w:before="20" w:after="20"/>
-      </w:pPr>
-      <w:r>
-        <w:rPr>
-          <w:b/>
-          <w:color w:val="888888"/>
-          <w:sz w:val="18"/>
-        </w:rPr>
-        <w:t xml:space="preserve">[51]  </w:t>
-      </w:r>
-      <w:r>
-        <w:rPr>
-          <w:sz w:val="22"/>
-        </w:rPr>
-        <w:t>He knows just enough to feel like he knows enough.</w:t>
-      </w:r>
-    </w:p>
-    <w:p>
-      <w:pPr>
-        <w:spacing w:before="20" w:after="20"/>
-      </w:pPr>
-      <w:r>
-        <w:rPr>
-          <w:b/>
-          <w:color w:val="888888"/>
-          <w:sz w:val="18"/>
-        </w:rPr>
-        <w:t xml:space="preserve">[52]  </w:t>
-      </w:r>
-      <w:r>
-        <w:rPr>
-          <w:sz w:val="22"/>
-        </w:rPr>
-        <w:t>That gap — between certainty and accuracy — is where Trap Three operates.</w:t>
+        <w:t>The expertise trap rewires in one direction: more vocabulary, more certainty — not more accuracy.</w:t>
       </w:r>
     </w:p>
     <w:p/>
@@ -1122,13 +837,13 @@
           <w:color w:val="888888"/>
           <w:sz w:val="18"/>
         </w:rPr>
-        <w:t xml:space="preserve">[53]  </w:t>
+        <w:t xml:space="preserve">[38]  </w:t>
       </w:r>
       <w:r>
         <w:rPr>
           <w:sz w:val="22"/>
         </w:rPr>
-        <w:t>It is 10:47pm on a Tuesday.</w:t>
+        <w:t>It is 10:47pm. Alex is tired.</w:t>
       </w:r>
     </w:p>
     <w:p>
@@ -1141,13 +856,13 @@
           <w:color w:val="888888"/>
           <w:sz w:val="18"/>
         </w:rPr>
-        <w:t xml:space="preserve">[54]  </w:t>
+        <w:t xml:space="preserve">[39]  </w:t>
       </w:r>
       <w:r>
         <w:rPr>
           <w:sz w:val="22"/>
         </w:rPr>
-        <w:t>Alex is tired. He has been making decisions since 7am.</w:t>
+        <w:t>He has been making decisions since 7am.</w:t>
       </w:r>
     </w:p>
     <w:p>
@@ -1160,13 +875,13 @@
           <w:color w:val="888888"/>
           <w:sz w:val="18"/>
         </w:rPr>
-        <w:t xml:space="preserve">[55]  </w:t>
+        <w:t xml:space="preserve">[40]  </w:t>
       </w:r>
       <w:r>
         <w:rPr>
           <w:sz w:val="22"/>
         </w:rPr>
-        <w:t>He adds something to his cart. He's not sure he needs it. He buys it.</w:t>
+        <w:t>He adds something to his cart. He buys it.</w:t>
       </w:r>
     </w:p>
     <w:p>
@@ -1179,13 +894,13 @@
           <w:color w:val="888888"/>
           <w:sz w:val="18"/>
         </w:rPr>
-        <w:t xml:space="preserve">[56]  </w:t>
+        <w:t xml:space="preserve">[41]  </w:t>
       </w:r>
       <w:r>
         <w:rPr>
           <w:sz w:val="22"/>
         </w:rPr>
-        <w:t>Shai Danziger — behavioral scientist at Ben-Gurion University —</w:t>
+        <w:t>Shai Danziger — Ben-Gurion University — studied eight judges over ten months.</w:t>
       </w:r>
     </w:p>
     <w:p>
@@ -1198,13 +913,13 @@
           <w:color w:val="888888"/>
           <w:sz w:val="18"/>
         </w:rPr>
-        <w:t xml:space="preserve">[57]  </w:t>
+        <w:t xml:space="preserve">[42]  </w:t>
       </w:r>
       <w:r>
         <w:rPr>
           <w:sz w:val="22"/>
         </w:rPr>
-        <w:t>studied eight judges over ten months.</w:t>
+        <w:t>Morning: parole granted sixty-five percent of the time.</w:t>
       </w:r>
     </w:p>
     <w:p>
@@ -1217,26 +932,7 @@
           <w:color w:val="888888"/>
           <w:sz w:val="18"/>
         </w:rPr>
-        <w:t xml:space="preserve">[58]  </w:t>
-      </w:r>
-      <w:r>
-        <w:rPr>
-          <w:sz w:val="22"/>
-        </w:rPr>
-        <w:t>At the start of the day, parole was granted sixty-five percent of the time.</w:t>
-      </w:r>
-    </w:p>
-    <w:p>
-      <w:pPr>
-        <w:spacing w:before="20" w:after="20"/>
-      </w:pPr>
-      <w:r>
-        <w:rPr>
-          <w:b/>
-          <w:color w:val="888888"/>
-          <w:sz w:val="18"/>
-        </w:rPr>
-        <w:t xml:space="preserve">[59]  </w:t>
+        <w:t xml:space="preserve">[43]  </w:t>
       </w:r>
       <w:r>
         <w:rPr>
@@ -1255,7 +951,7 @@
           <w:color w:val="888888"/>
           <w:sz w:val="18"/>
         </w:rPr>
-        <w:t xml:space="preserve">[60]  </w:t>
+        <w:t xml:space="preserve">[44]  </w:t>
       </w:r>
       <w:r>
         <w:rPr>
@@ -1274,70 +970,13 @@
           <w:color w:val="888888"/>
           <w:sz w:val="18"/>
         </w:rPr>
-        <w:t xml:space="preserve">[61]  </w:t>
+        <w:t xml:space="preserve">[45]  </w:t>
       </w:r>
       <w:r>
         <w:rPr>
           <w:sz w:val="22"/>
         </w:rPr>
-        <w:t>The same depletion curve runs in Alex's financial decisions.</w:t>
-      </w:r>
-    </w:p>
-    <w:p>
-      <w:pPr>
-        <w:spacing w:before="20" w:after="20"/>
-      </w:pPr>
-      <w:r>
-        <w:rPr>
-          <w:b/>
-          <w:color w:val="888888"/>
-          <w:sz w:val="18"/>
-        </w:rPr>
-        <w:t xml:space="preserve">[62]  </w:t>
-      </w:r>
-      <w:r>
-        <w:rPr>
-          <w:sz w:val="22"/>
-        </w:rPr>
-        <w:t>Impulse purchases peak between nine and midnight.</w:t>
-      </w:r>
-    </w:p>
-    <w:p>
-      <w:pPr>
-        <w:spacing w:before="20" w:after="20"/>
-      </w:pPr>
-      <w:r>
-        <w:rPr>
-          <w:b/>
-          <w:color w:val="888888"/>
-          <w:sz w:val="18"/>
-        </w:rPr>
-        <w:t xml:space="preserve">[63]  </w:t>
-      </w:r>
-      <w:r>
-        <w:rPr>
-          <w:sz w:val="22"/>
-        </w:rPr>
-        <w:t>Ego depletion is maximum. Resistance is minimum.</w:t>
-      </w:r>
-    </w:p>
-    <w:p>
-      <w:pPr>
-        <w:spacing w:before="20" w:after="20"/>
-      </w:pPr>
-      <w:r>
-        <w:rPr>
-          <w:b/>
-          <w:color w:val="888888"/>
-          <w:sz w:val="18"/>
-        </w:rPr>
-        <w:t xml:space="preserve">[64]  </w:t>
-      </w:r>
-      <w:r>
-        <w:rPr>
-          <w:sz w:val="22"/>
-        </w:rPr>
-        <w:t>The Brain Villain doesn't need to be clever at 10pm. It only needs to wait.</w:t>
+        <w:t>Impulse purchases peak between nine and midnight. The Brain Villain doesn't need to be clever. It only needs to wait.</w:t>
       </w:r>
     </w:p>
     <w:p/>
@@ -1364,7 +1003,7 @@
           <w:color w:val="888888"/>
           <w:sz w:val="18"/>
         </w:rPr>
-        <w:t xml:space="preserve">[65]  </w:t>
+        <w:t xml:space="preserve">[46]  </w:t>
       </w:r>
       <w:r>
         <w:rPr>
@@ -1383,26 +1022,7 @@
           <w:color w:val="888888"/>
           <w:sz w:val="18"/>
         </w:rPr>
-        <w:t xml:space="preserve">[66]  </w:t>
-      </w:r>
-      <w:r>
-        <w:rPr>
-          <w:sz w:val="22"/>
-        </w:rPr>
-        <w:t>He estimated it would make him happy for at least a year.</w:t>
-      </w:r>
-    </w:p>
-    <w:p>
-      <w:pPr>
-        <w:spacing w:before="20" w:after="20"/>
-      </w:pPr>
-      <w:r>
-        <w:rPr>
-          <w:b/>
-          <w:color w:val="888888"/>
-          <w:sz w:val="18"/>
-        </w:rPr>
-        <w:t xml:space="preserve">[67]  </w:t>
+        <w:t xml:space="preserve">[47]  </w:t>
       </w:r>
       <w:r>
         <w:rPr>
@@ -1421,13 +1041,13 @@
           <w:color w:val="888888"/>
           <w:sz w:val="18"/>
         </w:rPr>
-        <w:t xml:space="preserve">[68]  </w:t>
+        <w:t xml:space="preserve">[48]  </w:t>
       </w:r>
       <w:r>
         <w:rPr>
           <w:sz w:val="22"/>
         </w:rPr>
-        <w:t>Kent Berridge — neuroscientist at the University of Michigan —</w:t>
+        <w:t>Kent Berridge — University of Michigan — spent thirty years separating two systems.</w:t>
       </w:r>
     </w:p>
     <w:p>
@@ -1440,26 +1060,7 @@
           <w:color w:val="888888"/>
           <w:sz w:val="18"/>
         </w:rPr>
-        <w:t xml:space="preserve">[69]  </w:t>
-      </w:r>
-      <w:r>
-        <w:rPr>
-          <w:sz w:val="22"/>
-        </w:rPr>
-        <w:t>spent thirty years separating two systems that feel like one.</w:t>
-      </w:r>
-    </w:p>
-    <w:p>
-      <w:pPr>
-        <w:spacing w:before="20" w:after="20"/>
-      </w:pPr>
-      <w:r>
-        <w:rPr>
-          <w:b/>
-          <w:color w:val="888888"/>
-          <w:sz w:val="18"/>
-        </w:rPr>
-        <w:t xml:space="preserve">[70]  </w:t>
+        <w:t xml:space="preserve">[49]  </w:t>
       </w:r>
       <w:r>
         <w:rPr>
@@ -1478,7 +1079,7 @@
           <w:color w:val="888888"/>
           <w:sz w:val="18"/>
         </w:rPr>
-        <w:t xml:space="preserve">[71]  </w:t>
+        <w:t xml:space="preserve">[50]  </w:t>
       </w:r>
       <w:r>
         <w:rPr>
@@ -1497,7 +1098,7 @@
           <w:color w:val="888888"/>
           <w:sz w:val="18"/>
         </w:rPr>
-        <w:t xml:space="preserve">[72]  </w:t>
+        <w:t xml:space="preserve">[51]  </w:t>
       </w:r>
       <w:r>
         <w:rPr>
@@ -1516,13 +1117,13 @@
           <w:color w:val="888888"/>
           <w:sz w:val="18"/>
         </w:rPr>
-        <w:t xml:space="preserve">[73]  </w:t>
+        <w:t xml:space="preserve">[52]  </w:t>
       </w:r>
       <w:r>
         <w:rPr>
           <w:sz w:val="22"/>
         </w:rPr>
-        <w:t>Every upgrade strengthens wanting. And habituates liking.</w:t>
+        <w:t>Every upgrade strengthens wanting and habituates liking.</w:t>
       </w:r>
     </w:p>
     <w:p>
@@ -1535,83 +1136,7 @@
           <w:color w:val="888888"/>
           <w:sz w:val="18"/>
         </w:rPr>
-        <w:t xml:space="preserve">[74]  </w:t>
-      </w:r>
-      <w:r>
-        <w:rPr>
-          <w:sz w:val="22"/>
-        </w:rPr>
-        <w:t>After six months in the better apartment, Alex doesn't enjoy it more.</w:t>
-      </w:r>
-    </w:p>
-    <w:p>
-      <w:pPr>
-        <w:spacing w:before="20" w:after="20"/>
-      </w:pPr>
-      <w:r>
-        <w:rPr>
-          <w:b/>
-          <w:color w:val="888888"/>
-          <w:sz w:val="18"/>
-        </w:rPr>
-        <w:t xml:space="preserve">[75]  </w:t>
-      </w:r>
-      <w:r>
-        <w:rPr>
-          <w:sz w:val="22"/>
-        </w:rPr>
-        <w:t>He needs the next upgrade.</w:t>
-      </w:r>
-    </w:p>
-    <w:p>
-      <w:pPr>
-        <w:spacing w:before="20" w:after="20"/>
-      </w:pPr>
-      <w:r>
-        <w:rPr>
-          <w:b/>
-          <w:color w:val="888888"/>
-          <w:sz w:val="18"/>
-        </w:rPr>
-        <w:t xml:space="preserve">[76]  </w:t>
-      </w:r>
-      <w:r>
-        <w:rPr>
-          <w:sz w:val="22"/>
-        </w:rPr>
-        <w:t>This is not preference. It is neuroplasticity.</w:t>
-      </w:r>
-    </w:p>
-    <w:p>
-      <w:pPr>
-        <w:spacing w:before="20" w:after="20"/>
-      </w:pPr>
-      <w:r>
-        <w:rPr>
-          <w:b/>
-          <w:color w:val="888888"/>
-          <w:sz w:val="18"/>
-        </w:rPr>
-        <w:t xml:space="preserve">[77]  </w:t>
-      </w:r>
-      <w:r>
-        <w:rPr>
-          <w:sz w:val="22"/>
-        </w:rPr>
-        <w:t>The brain has physically downregulated its response to the current level.</w:t>
-      </w:r>
-    </w:p>
-    <w:p>
-      <w:pPr>
-        <w:spacing w:before="20" w:after="20"/>
-      </w:pPr>
-      <w:r>
-        <w:rPr>
-          <w:b/>
-          <w:color w:val="888888"/>
-          <w:sz w:val="18"/>
-        </w:rPr>
-        <w:t xml:space="preserve">[78]  </w:t>
+        <w:t xml:space="preserve">[53]  </w:t>
       </w:r>
       <w:r>
         <w:rPr>
@@ -1630,7 +1155,7 @@
           <w:color w:val="888888"/>
           <w:sz w:val="18"/>
         </w:rPr>
-        <w:t xml:space="preserve">[79]  </w:t>
+        <w:t xml:space="preserve">[54]  </w:t>
       </w:r>
       <w:r>
         <w:rPr>
@@ -1663,13 +1188,13 @@
           <w:color w:val="888888"/>
           <w:sz w:val="18"/>
         </w:rPr>
-        <w:t xml:space="preserve">[80]  </w:t>
+        <w:t xml:space="preserve">[55]  </w:t>
       </w:r>
       <w:r>
         <w:rPr>
           <w:sz w:val="22"/>
         </w:rPr>
-        <w:t>Here is what makes these five programs expensive: they do not run independently.</w:t>
+        <w:t>Five programs. Running simultaneously. Without Alex's permission.</w:t>
       </w:r>
     </w:p>
     <w:p>
@@ -1682,13 +1207,13 @@
           <w:color w:val="888888"/>
           <w:sz w:val="18"/>
         </w:rPr>
-        <w:t xml:space="preserve">[81]  </w:t>
+        <w:t xml:space="preserve">[56]  </w:t>
       </w:r>
       <w:r>
         <w:rPr>
           <w:sz w:val="22"/>
         </w:rPr>
-        <w:t>Trap One generates the impulse. Trap Two makes it invisible.</w:t>
+        <w:t>Trap One generates the impulse. Trap Two hides the damage. Trap Three provides the vocabulary to justify it.</w:t>
       </w:r>
     </w:p>
     <w:p>
@@ -1701,13 +1226,13 @@
           <w:color w:val="888888"/>
           <w:sz w:val="18"/>
         </w:rPr>
-        <w:t xml:space="preserve">[82]  </w:t>
+        <w:t xml:space="preserve">[57]  </w:t>
       </w:r>
       <w:r>
         <w:rPr>
           <w:sz w:val="22"/>
         </w:rPr>
-        <w:t>Trap Three gives Alex the vocabulary to justify what he never examines.</w:t>
+        <w:t>Trap Four lowers resistance at the exact moment it's needed most. Trap Five raises the floor so he cannot return.</w:t>
       </w:r>
     </w:p>
     <w:p>
@@ -1720,51 +1245,13 @@
           <w:color w:val="888888"/>
           <w:sz w:val="18"/>
         </w:rPr>
-        <w:t xml:space="preserve">[83]  </w:t>
+        <w:t xml:space="preserve">[58]  </w:t>
       </w:r>
       <w:r>
         <w:rPr>
           <w:sz w:val="22"/>
         </w:rPr>
-        <w:t>Trap Four lowers resistance at exactly the right moment.</w:t>
-      </w:r>
-    </w:p>
-    <w:p>
-      <w:pPr>
-        <w:spacing w:before="20" w:after="20"/>
-      </w:pPr>
-      <w:r>
-        <w:rPr>
-          <w:b/>
-          <w:color w:val="888888"/>
-          <w:sz w:val="18"/>
-        </w:rPr>
-        <w:t xml:space="preserve">[84]  </w:t>
-      </w:r>
-      <w:r>
-        <w:rPr>
-          <w:sz w:val="22"/>
-        </w:rPr>
-        <w:t>Trap Five raises the floor so he cannot return to where he started.</w:t>
-      </w:r>
-    </w:p>
-    <w:p>
-      <w:pPr>
-        <w:spacing w:before="20" w:after="20"/>
-      </w:pPr>
-      <w:r>
-        <w:rPr>
-          <w:b/>
-          <w:color w:val="888888"/>
-          <w:sz w:val="18"/>
-        </w:rPr>
-        <w:t xml:space="preserve">[85]  </w:t>
-      </w:r>
-      <w:r>
-        <w:rPr>
-          <w:sz w:val="22"/>
-        </w:rPr>
-        <w:t>Kahneman and Deaton — Princeton, 2010 — found that behavioral programs consume the same percentage of income at €40,000 as at €140,000. The math adjusts. The programs don't.</w:t>
+        <w:t>Kahneman and Deaton — Princeton, 2010 — found these programs consume the same percentage of income at €40,000 as at €140,000. The math adjusts. The programs don't.</w:t>
       </w:r>
     </w:p>
     <w:p/>
@@ -1791,7 +1278,7 @@
           <w:color w:val="888888"/>
           <w:sz w:val="18"/>
         </w:rPr>
-        <w:t xml:space="preserve">[86]  </w:t>
+        <w:t xml:space="preserve">[59]  </w:t>
       </w:r>
       <w:r>
         <w:rPr>
@@ -1810,7 +1297,7 @@
           <w:color w:val="888888"/>
           <w:sz w:val="18"/>
         </w:rPr>
-        <w:t xml:space="preserve">[87]  </w:t>
+        <w:t xml:space="preserve">[60]  </w:t>
       </w:r>
       <w:r>
         <w:rPr>
@@ -1829,7 +1316,7 @@
           <w:color w:val="888888"/>
           <w:sz w:val="18"/>
         </w:rPr>
-        <w:t xml:space="preserve">[88]  </w:t>
+        <w:t xml:space="preserve">[61]  </w:t>
       </w:r>
       <w:r>
         <w:rPr>
@@ -1848,13 +1335,13 @@
           <w:color w:val="888888"/>
           <w:sz w:val="18"/>
         </w:rPr>
-        <w:t xml:space="preserve">[89]  </w:t>
+        <w:t xml:space="preserve">[62]  </w:t>
       </w:r>
       <w:r>
         <w:rPr>
           <w:sz w:val="22"/>
         </w:rPr>
-        <w:t>Something that sounds like rationality: ‘I already know this.’</w:t>
+        <w:t>Something that sounds like rationality: 'I already know this.'</w:t>
       </w:r>
     </w:p>
     <w:p>
@@ -1867,7 +1354,7 @@
           <w:color w:val="888888"/>
           <w:sz w:val="18"/>
         </w:rPr>
-        <w:t xml:space="preserve">[90]  </w:t>
+        <w:t xml:space="preserve">[63]  </w:t>
       </w:r>
       <w:r>
         <w:rPr>
@@ -1886,7 +1373,7 @@
           <w:color w:val="888888"/>
           <w:sz w:val="18"/>
         </w:rPr>
-        <w:t xml:space="preserve">[91]  </w:t>
+        <w:t xml:space="preserve">[64]  </w:t>
       </w:r>
       <w:r>
         <w:rPr>
@@ -1905,7 +1392,7 @@
           <w:color w:val="888888"/>
           <w:sz w:val="18"/>
         </w:rPr>
-        <w:t xml:space="preserve">[92]  </w:t>
+        <w:t xml:space="preserve">[65]  </w:t>
       </w:r>
       <w:r>
         <w:rPr>
@@ -1924,7 +1411,7 @@
           <w:color w:val="888888"/>
           <w:sz w:val="18"/>
         </w:rPr>
-        <w:t xml:space="preserve">[93]  </w:t>
+        <w:t xml:space="preserve">[66]  </w:t>
       </w:r>
       <w:r>
         <w:rPr>
@@ -1943,13 +1430,13 @@
           <w:color w:val="888888"/>
           <w:sz w:val="18"/>
         </w:rPr>
-        <w:t xml:space="preserve">[94]  </w:t>
+        <w:t xml:space="preserve">[67]  </w:t>
       </w:r>
       <w:r>
         <w:rPr>
           <w:sz w:val="22"/>
         </w:rPr>
-        <w:t>Knowing the name of a predator kept your ancestors alive. It doesn't stop the dopamine.</w:t>
+        <w:t>Knowing the name of a predator kept your ancestors alive.</w:t>
       </w:r>
     </w:p>
     <w:p>
@@ -1962,13 +1449,13 @@
           <w:color w:val="888888"/>
           <w:sz w:val="18"/>
         </w:rPr>
-        <w:t xml:space="preserve">[95]  </w:t>
+        <w:t xml:space="preserve">[68]  </w:t>
       </w:r>
       <w:r>
         <w:rPr>
           <w:sz w:val="22"/>
         </w:rPr>
-        <w:t>The Brain Villain was built for that world. Not this one.</w:t>
+        <w:t>It doesn't stop the dopamine.</w:t>
       </w:r>
     </w:p>
     <w:p>
@@ -1981,13 +1468,13 @@
           <w:color w:val="888888"/>
           <w:sz w:val="18"/>
         </w:rPr>
-        <w:t xml:space="preserve">[96]  </w:t>
+        <w:t xml:space="preserve">[69]  </w:t>
       </w:r>
       <w:r>
         <w:rPr>
           <w:sz w:val="22"/>
         </w:rPr>
-        <w:t>The next video shows the one structural decision that shuts down three of the five simultaneously.</w:t>
+        <w:t>The Brain Villain was built for that world. Not this one.</w:t>
       </w:r>
     </w:p>
     <w:p/>
@@ -2014,7 +1501,7 @@
           <w:color w:val="888888"/>
           <w:sz w:val="18"/>
         </w:rPr>
-        <w:t xml:space="preserve">[97]  </w:t>
+        <w:t xml:space="preserve">[70]  </w:t>
       </w:r>
       <w:r>
         <w:rPr>
@@ -2033,13 +1520,13 @@
           <w:color w:val="888888"/>
           <w:sz w:val="18"/>
         </w:rPr>
-        <w:t xml:space="preserve">[98]  </w:t>
+        <w:t xml:space="preserve">[71]  </w:t>
       </w:r>
       <w:r>
         <w:rPr>
           <w:sz w:val="22"/>
         </w:rPr>
-        <w:t>Anticipation Burn kept ancestors motivated to hunt. Balance Blindspot reduced cortisol. Night Drain was instinct. Upgrade Lock meant survival.</w:t>
+        <w:t>Anticipation Burn kept ancestors motivated. Balance Blindspot reduced cortisol when debt meant death. Night Drain was adaptive instinct. Upgrade Lock meant survival.</w:t>
       </w:r>
     </w:p>
     <w:p>
@@ -2052,7 +1539,7 @@
           <w:color w:val="888888"/>
           <w:sz w:val="18"/>
         </w:rPr>
-        <w:t xml:space="preserve">[99]  </w:t>
+        <w:t xml:space="preserve">[72]  </w:t>
       </w:r>
       <w:r>
         <w:rPr>
@@ -2071,7 +1558,7 @@
           <w:color w:val="888888"/>
           <w:sz w:val="18"/>
         </w:rPr>
-        <w:t xml:space="preserve">[100]  </w:t>
+        <w:t xml:space="preserve">[73]  </w:t>
       </w:r>
       <w:r>
         <w:rPr>
@@ -2090,7 +1577,7 @@
           <w:color w:val="888888"/>
           <w:sz w:val="18"/>
         </w:rPr>
-        <w:t xml:space="preserve">[101]  </w:t>
+        <w:t xml:space="preserve">[74]  </w:t>
       </w:r>
       <w:r>
         <w:rPr>
@@ -2109,13 +1596,13 @@
           <w:color w:val="888888"/>
           <w:sz w:val="18"/>
         </w:rPr>
-        <w:t xml:space="preserve">[102]  </w:t>
+        <w:t xml:space="preserve">[75]  </w:t>
       </w:r>
       <w:r>
         <w:rPr>
           <w:sz w:val="22"/>
         </w:rPr>
-        <w:t>Naming them doesn't silence them. But it is the first condition for building a system around them.</w:t>
+        <w:t>The next video maps the one structural decision that shuts down three of these five simultaneously.</w:t>
       </w:r>
     </w:p>
     <w:p>
@@ -2128,7 +1615,7 @@
           <w:color w:val="888888"/>
           <w:sz w:val="18"/>
         </w:rPr>
-        <w:t xml:space="preserve">[103]  </w:t>
+        <w:t xml:space="preserve">[76]  </w:t>
       </w:r>
       <w:r>
         <w:rPr>
@@ -2147,7 +1634,7 @@
           <w:color w:val="888888"/>
           <w:sz w:val="18"/>
         </w:rPr>
-        <w:t xml:space="preserve">[104]  </w:t>
+        <w:t xml:space="preserve">[77]  </w:t>
       </w:r>
       <w:r>
         <w:rPr>
@@ -2166,7 +1653,7 @@
           <w:color w:val="666666"/>
           <w:sz w:val="18"/>
         </w:rPr>
-        <w:t>TOTAL: 104 beats · ~1032 words · ~7 min</w:t>
+        <w:t>TOTAL: 77 beats · ~780 words · ~6 min</w:t>
       </w:r>
     </w:p>
     <w:sectPr>

</xml_diff>